<commit_message>
fix: resolve rubric C1-C6 (data model, schema, seed, specs, docs)
</commit_message>
<xml_diff>
--- a/docs/word/data/01-entity-dictionary.docx
+++ b/docs/word/data/01-entity-dictionary.docx
@@ -141,7 +141,16 @@
         <w:rPr>
           <w:rStyle w:val="VerbatimChar"/>
         </w:rPr>
-        <w:t xml:space="preserve">              (every field typed, inputs marked Req / Opt)</w:t>
+        <w:t xml:space="preserve">              (every field typed, inputs marked Req / Opt), plus section 6.1</w:t>
+      </w:r>
+      <w:r>
+        <w:br/>
+      </w:r>
+      <w:r>
+        <w:rPr>
+          <w:rStyle w:val="VerbatimChar"/>
+        </w:rPr>
+        <w:t xml:space="preserve">              "Attribute types" (types of the section 6 attributes no 5.1 field declares)</w:t>
       </w:r>
       <w:r>
         <w:br/>
@@ -186,7 +195,7 @@
         <w:rPr>
           <w:rStyle w:val="VerbatimChar"/>
         </w:rPr>
-        <w:t xml:space="preserve">  SCREENS   = section 7 tables + docs/screens/screen-spec-&lt;ID&gt;.md (20 Screen Specs)</w:t>
+        <w:t xml:space="preserve">  SCREENS   = section 7 tables + docs/screens/screen-spec-&lt;ID&gt;.md (41 Screen Specs)</w:t>
       </w:r>
       <w:r>
         <w:br/>
@@ -216,16 +225,7 @@
         <w:rPr>
           <w:rStyle w:val="VerbatimChar"/>
         </w:rPr>
-        <w:t xml:space="preserve">  Out of this input: M6, M8, M9 are Won't for this release (docs/mvp-scope.md §4).</w:t>
-      </w:r>
-      <w:r>
-        <w:br/>
-      </w:r>
-      <w:r>
-        <w:rPr>
-          <w:rStyle w:val="VerbatimChar"/>
-        </w:rPr>
-        <w:t xml:space="preserve">  The M10 screens (SC-34, SC-38 .. SC-41) have no Screen Spec file yet.</w:t>
+        <w:t xml:space="preserve">  Out of this input: M6, M8, M9 are Won't for this release (docs/prd.md §4.4).</w:t>
       </w:r>
       <w:r>
         <w:br/>
@@ -6005,7 +6005,39 @@
           <w:p>
             <w:pPr>
               <w:pStyle w:val="Compact"/>
-            </w:pPr>
+              <w:jc w:val="left"/>
+            </w:pPr>
+            <w:r>
+              <w:rPr>
+                <w:sz w:val="17"/>
+              </w:rPr>
+              <w:t xml:space="preserve">Applied: two entities.</w:t>
+            </w:r>
+            <w:r>
+              <w:rPr>
+                <w:sz w:val="17"/>
+              </w:rPr>
+              <w:t xml:space="preserve"> </w:t>
+            </w:r>
+            <w:r>
+              <w:rPr>
+                <w:rStyle w:val="VerbatimChar"/>
+                <w:sz w:val="17"/>
+              </w:rPr>
+              <w:t xml:space="preserve">reviewer_org_id</w:t>
+            </w:r>
+            <w:r>
+              <w:rPr>
+                <w:sz w:val="17"/>
+              </w:rPr>
+              <w:t xml:space="preserve"> </w:t>
+            </w:r>
+            <w:r>
+              <w:rPr>
+                <w:sz w:val="17"/>
+              </w:rPr>
+              <w:t xml:space="preserve">points to ORGANISATION (the Vietnamese partner).</w:t>
+            </w:r>
           </w:p>
         </w:tc>
       </w:tr>
@@ -6075,7 +6107,39 @@
           <w:p>
             <w:pPr>
               <w:pStyle w:val="Compact"/>
-            </w:pPr>
+              <w:jc w:val="left"/>
+            </w:pPr>
+            <w:r>
+              <w:rPr>
+                <w:sz w:val="17"/>
+              </w:rPr>
+              <w:t xml:space="preserve">Applied: SEGMENT_RULE key renamed</w:t>
+            </w:r>
+            <w:r>
+              <w:rPr>
+                <w:sz w:val="17"/>
+              </w:rPr>
+              <w:t xml:space="preserve"> </w:t>
+            </w:r>
+            <w:r>
+              <w:rPr>
+                <w:rStyle w:val="VerbatimChar"/>
+                <w:sz w:val="17"/>
+              </w:rPr>
+              <w:t xml:space="preserve">segment_rule_id</w:t>
+            </w:r>
+            <w:r>
+              <w:rPr>
+                <w:sz w:val="17"/>
+              </w:rPr>
+              <w:t xml:space="preserve"> </w:t>
+            </w:r>
+            <w:r>
+              <w:rPr>
+                <w:sz w:val="17"/>
+              </w:rPr>
+              <w:t xml:space="preserve">(M1 §6.1).</w:t>
+            </w:r>
           </w:p>
         </w:tc>
       </w:tr>
@@ -6145,7 +6209,39 @@
           <w:p>
             <w:pPr>
               <w:pStyle w:val="Compact"/>
-            </w:pPr>
+              <w:jc w:val="left"/>
+            </w:pPr>
+            <w:r>
+              <w:rPr>
+                <w:sz w:val="17"/>
+              </w:rPr>
+              <w:t xml:space="preserve">Applied: BILINGUAL_DOCUMENT is keyed by project_id + doc_code; F-M5-06</w:t>
+            </w:r>
+            <w:r>
+              <w:rPr>
+                <w:sz w:val="17"/>
+              </w:rPr>
+              <w:t xml:space="preserve"> </w:t>
+            </w:r>
+            <w:r>
+              <w:rPr>
+                <w:rStyle w:val="VerbatimChar"/>
+                <w:sz w:val="17"/>
+              </w:rPr>
+              <w:t xml:space="preserve">document_id</w:t>
+            </w:r>
+            <w:r>
+              <w:rPr>
+                <w:sz w:val="17"/>
+              </w:rPr>
+              <w:t xml:space="preserve"> </w:t>
+            </w:r>
+            <w:r>
+              <w:rPr>
+                <w:sz w:val="17"/>
+              </w:rPr>
+              <w:t xml:space="preserve">is read as that pair.</w:t>
+            </w:r>
           </w:p>
         </w:tc>
       </w:tr>
@@ -6313,7 +6409,111 @@
           <w:p>
             <w:pPr>
               <w:pStyle w:val="Compact"/>
-            </w:pPr>
+              <w:jc w:val="left"/>
+            </w:pPr>
+            <w:r>
+              <w:rPr>
+                <w:sz w:val="17"/>
+              </w:rPr>
+              <w:t xml:space="preserve">Applied: glossary —</w:t>
+            </w:r>
+            <w:r>
+              <w:rPr>
+                <w:sz w:val="17"/>
+              </w:rPr>
+              <w:t xml:space="preserve"> </w:t>
+            </w:r>
+            <w:r>
+              <w:rPr>
+                <w:iCs/>
+                <w:i/>
+                <w:sz w:val="17"/>
+              </w:rPr>
+              <w:t xml:space="preserve">partner organisation</w:t>
+            </w:r>
+            <w:r>
+              <w:rPr>
+                <w:sz w:val="17"/>
+              </w:rPr>
+              <w:t xml:space="preserve"> </w:t>
+            </w:r>
+            <w:r>
+              <w:rPr>
+                <w:sz w:val="17"/>
+              </w:rPr>
+              <w:t xml:space="preserve">(ORGANISATION),</w:t>
+            </w:r>
+            <w:r>
+              <w:rPr>
+                <w:sz w:val="17"/>
+              </w:rPr>
+              <w:t xml:space="preserve"> </w:t>
+            </w:r>
+            <w:r>
+              <w:rPr>
+                <w:iCs/>
+                <w:i/>
+                <w:sz w:val="17"/>
+              </w:rPr>
+              <w:t xml:space="preserve">partner account</w:t>
+            </w:r>
+            <w:r>
+              <w:rPr>
+                <w:sz w:val="17"/>
+              </w:rPr>
+              <w:t xml:space="preserve"> </w:t>
+            </w:r>
+            <w:r>
+              <w:rPr>
+                <w:sz w:val="17"/>
+              </w:rPr>
+              <w:t xml:space="preserve">(role</w:t>
+            </w:r>
+            <w:r>
+              <w:rPr>
+                <w:sz w:val="17"/>
+              </w:rPr>
+              <w:t xml:space="preserve"> </w:t>
+            </w:r>
+            <w:r>
+              <w:rPr>
+                <w:rStyle w:val="VerbatimChar"/>
+                <w:sz w:val="17"/>
+              </w:rPr>
+              <w:t xml:space="preserve">partner</w:t>
+            </w:r>
+            <w:r>
+              <w:rPr>
+                <w:sz w:val="17"/>
+              </w:rPr>
+              <w:t xml:space="preserve">),</w:t>
+            </w:r>
+            <w:r>
+              <w:rPr>
+                <w:sz w:val="17"/>
+              </w:rPr>
+              <w:t xml:space="preserve"> </w:t>
+            </w:r>
+            <w:r>
+              <w:rPr>
+                <w:iCs/>
+                <w:i/>
+                <w:sz w:val="17"/>
+              </w:rPr>
+              <w:t xml:space="preserve">partner party</w:t>
+            </w:r>
+            <w:r>
+              <w:rPr>
+                <w:sz w:val="17"/>
+              </w:rPr>
+              <w:t xml:space="preserve"> </w:t>
+            </w:r>
+            <w:r>
+              <w:rPr>
+                <w:sz w:val="17"/>
+              </w:rPr>
+              <w:t xml:space="preserve">(NDA_ACCEPTANCE.party).</w:t>
+            </w:r>
           </w:p>
         </w:tc>
       </w:tr>
@@ -6383,7 +6583,33 @@
           <w:p>
             <w:pPr>
               <w:pStyle w:val="Compact"/>
-            </w:pPr>
+              <w:jc w:val="left"/>
+            </w:pPr>
+            <w:r>
+              <w:rPr>
+                <w:sz w:val="17"/>
+              </w:rPr>
+              <w:t xml:space="preserve">Applied: entity PRECHECK_RUN; key keeps the spec name</w:t>
+            </w:r>
+            <w:r>
+              <w:rPr>
+                <w:sz w:val="17"/>
+              </w:rPr>
+              <w:t xml:space="preserve"> </w:t>
+            </w:r>
+            <w:r>
+              <w:rPr>
+                <w:rStyle w:val="VerbatimChar"/>
+                <w:sz w:val="17"/>
+              </w:rPr>
+              <w:t xml:space="preserve">brief_id</w:t>
+            </w:r>
+            <w:r>
+              <w:rPr>
+                <w:sz w:val="17"/>
+              </w:rPr>
+              <w:t xml:space="preserve">.</w:t>
+            </w:r>
           </w:p>
         </w:tc>
       </w:tr>
@@ -6453,7 +6679,14 @@
           <w:p>
             <w:pPr>
               <w:pStyle w:val="Compact"/>
-            </w:pPr>
+              <w:jc w:val="left"/>
+            </w:pPr>
+            <w:r>
+              <w:rPr>
+                <w:sz w:val="17"/>
+              </w:rPr>
+              <w:t xml:space="preserve">Applied: three column names kept as each spec declares them, one shared value set ENUM(u15, 15_50, o50).</w:t>
+            </w:r>
           </w:p>
         </w:tc>
       </w:tr>
@@ -6523,7 +6756,39 @@
           <w:p>
             <w:pPr>
               <w:pStyle w:val="Compact"/>
-            </w:pPr>
+              <w:jc w:val="left"/>
+            </w:pPr>
+            <w:r>
+              <w:rPr>
+                <w:sz w:val="17"/>
+              </w:rPr>
+              <w:t xml:space="preserve">Applied: one column</w:t>
+            </w:r>
+            <w:r>
+              <w:rPr>
+                <w:sz w:val="17"/>
+              </w:rPr>
+              <w:t xml:space="preserve"> </w:t>
+            </w:r>
+            <w:r>
+              <w:rPr>
+                <w:rStyle w:val="VerbatimChar"/>
+                <w:sz w:val="17"/>
+              </w:rPr>
+              <w:t xml:space="preserve">lang</w:t>
+            </w:r>
+            <w:r>
+              <w:rPr>
+                <w:sz w:val="17"/>
+              </w:rPr>
+              <w:t xml:space="preserve"> </w:t>
+            </w:r>
+            <w:r>
+              <w:rPr>
+                <w:sz w:val="17"/>
+              </w:rPr>
+              <w:t xml:space="preserve">ENUM(en, vi) (F-M2-05 input).</w:t>
+            </w:r>
           </w:p>
         </w:tc>
       </w:tr>
@@ -6593,7 +6858,39 @@
           <w:p>
             <w:pPr>
               <w:pStyle w:val="Compact"/>
-            </w:pPr>
+              <w:jc w:val="left"/>
+            </w:pPr>
+            <w:r>
+              <w:rPr>
+                <w:sz w:val="17"/>
+              </w:rPr>
+              <w:t xml:space="preserve">Applied: F-M7-02's</w:t>
+            </w:r>
+            <w:r>
+              <w:rPr>
+                <w:sz w:val="17"/>
+              </w:rPr>
+              <w:t xml:space="preserve"> </w:t>
+            </w:r>
+            <w:r>
+              <w:rPr>
+                <w:rStyle w:val="VerbatimChar"/>
+                <w:sz w:val="17"/>
+              </w:rPr>
+              <w:t xml:space="preserve">notification_id</w:t>
+            </w:r>
+            <w:r>
+              <w:rPr>
+                <w:sz w:val="17"/>
+              </w:rPr>
+              <w:t xml:space="preserve"> </w:t>
+            </w:r>
+            <w:r>
+              <w:rPr>
+                <w:sz w:val="17"/>
+              </w:rPr>
+              <w:t xml:space="preserve">is an EMAIL_DELIVERY (it has a delivery status), not an in-app NOTIFICATION.</w:t>
+            </w:r>
           </w:p>
         </w:tc>
       </w:tr>
@@ -6663,7 +6960,39 @@
           <w:p>
             <w:pPr>
               <w:pStyle w:val="Compact"/>
-            </w:pPr>
+              <w:jc w:val="left"/>
+            </w:pPr>
+            <w:r>
+              <w:rPr>
+                <w:sz w:val="17"/>
+              </w:rPr>
+              <w:t xml:space="preserve">Applied: VARCHAR(20), e.g.</w:t>
+            </w:r>
+            <w:r>
+              <w:rPr>
+                <w:sz w:val="17"/>
+              </w:rPr>
+              <w:t xml:space="preserve"> </w:t>
+            </w:r>
+            <w:r>
+              <w:rPr>
+                <w:rStyle w:val="VerbatimChar"/>
+                <w:sz w:val="17"/>
+              </w:rPr>
+              <w:t xml:space="preserve">2026.08</w:t>
+            </w:r>
+            <w:r>
+              <w:rPr>
+                <w:sz w:val="17"/>
+              </w:rPr>
+              <w:t xml:space="preserve"> </w:t>
+            </w:r>
+            <w:r>
+              <w:rPr>
+                <w:sz w:val="17"/>
+              </w:rPr>
+              <w:t xml:space="preserve">(M2 FR-004, US-1).</w:t>
+            </w:r>
           </w:p>
         </w:tc>
       </w:tr>
@@ -6733,7 +7062,14 @@
           <w:p>
             <w:pPr>
               <w:pStyle w:val="Compact"/>
-            </w:pPr>
+              <w:jc w:val="left"/>
+            </w:pPr>
+            <w:r>
+              <w:rPr>
+                <w:sz w:val="17"/>
+              </w:rPr>
+              <w:t xml:space="preserve">Applied: optional in storage; required by the functions that use it (M5 FR-007, M2 FR-017).</w:t>
+            </w:r>
           </w:p>
         </w:tc>
       </w:tr>
@@ -6803,7 +7139,65 @@
           <w:p>
             <w:pPr>
               <w:pStyle w:val="Compact"/>
-            </w:pPr>
+              <w:jc w:val="left"/>
+            </w:pPr>
+            <w:r>
+              <w:rPr>
+                <w:sz w:val="17"/>
+              </w:rPr>
+              <w:t xml:space="preserve">Applied: ENUM(A, B, C) = the overriding segment;</w:t>
+            </w:r>
+            <w:r>
+              <w:rPr>
+                <w:sz w:val="17"/>
+              </w:rPr>
+              <w:t xml:space="preserve"> </w:t>
+            </w:r>
+            <w:r>
+              <w:rPr>
+                <w:iCs/>
+                <w:i/>
+                <w:sz w:val="17"/>
+              </w:rPr>
+              <w:t xml:space="preserve">an override happened</w:t>
+            </w:r>
+            <w:r>
+              <w:rPr>
+                <w:sz w:val="17"/>
+              </w:rPr>
+              <w:t xml:space="preserve"> </w:t>
+            </w:r>
+            <w:r>
+              <w:rPr>
+                <w:sz w:val="17"/>
+              </w:rPr>
+              <w:t xml:space="preserve">=</w:t>
+            </w:r>
+            <w:r>
+              <w:rPr>
+                <w:sz w:val="17"/>
+              </w:rPr>
+              <w:t xml:space="preserve"> </w:t>
+            </w:r>
+            <w:r>
+              <w:rPr>
+                <w:rStyle w:val="VerbatimChar"/>
+                <w:sz w:val="17"/>
+              </w:rPr>
+              <w:t xml:space="preserve">segment_override</w:t>
+            </w:r>
+            <w:r>
+              <w:rPr>
+                <w:sz w:val="17"/>
+              </w:rPr>
+              <w:t xml:space="preserve"> </w:t>
+            </w:r>
+            <w:r>
+              <w:rPr>
+                <w:sz w:val="17"/>
+              </w:rPr>
+              <w:t xml:space="preserve">is set.</w:t>
+            </w:r>
           </w:p>
         </w:tc>
       </w:tr>
@@ -6886,7 +7280,14 @@
           <w:p>
             <w:pPr>
               <w:pStyle w:val="Compact"/>
-            </w:pPr>
+              <w:jc w:val="left"/>
+            </w:pPr>
+            <w:r>
+              <w:rPr>
+                <w:sz w:val="17"/>
+              </w:rPr>
+              <w:t xml:space="preserve">Applied: stored on PROFILE for members; the cookie is used only for guests.</w:t>
+            </w:r>
           </w:p>
         </w:tc>
       </w:tr>
@@ -6969,7 +7370,39 @@
           <w:p>
             <w:pPr>
               <w:pStyle w:val="Compact"/>
-            </w:pPr>
+              <w:jc w:val="left"/>
+            </w:pPr>
+            <w:r>
+              <w:rPr>
+                <w:sz w:val="17"/>
+              </w:rPr>
+              <w:t xml:space="preserve">Applied:</w:t>
+            </w:r>
+            <w:r>
+              <w:rPr>
+                <w:sz w:val="17"/>
+              </w:rPr>
+              <w:t xml:space="preserve"> </w:t>
+            </w:r>
+            <w:r>
+              <w:rPr>
+                <w:rStyle w:val="VerbatimChar"/>
+                <w:sz w:val="17"/>
+              </w:rPr>
+              <w:t xml:space="preserve">state</w:t>
+            </w:r>
+            <w:r>
+              <w:rPr>
+                <w:sz w:val="17"/>
+              </w:rPr>
+              <w:t xml:space="preserve"> </w:t>
+            </w:r>
+            <w:r>
+              <w:rPr>
+                <w:sz w:val="17"/>
+              </w:rPr>
+              <w:t xml:space="preserve">(SC-27 corrected 01/10/2026).</w:t>
+            </w:r>
           </w:p>
         </w:tc>
       </w:tr>
@@ -7109,7 +7542,39 @@
           <w:p>
             <w:pPr>
               <w:pStyle w:val="Compact"/>
-            </w:pPr>
+              <w:jc w:val="left"/>
+            </w:pPr>
+            <w:r>
+              <w:rPr>
+                <w:sz w:val="17"/>
+              </w:rPr>
+              <w:t xml:space="preserve">Applied:</w:t>
+            </w:r>
+            <w:r>
+              <w:rPr>
+                <w:sz w:val="17"/>
+              </w:rPr>
+              <w:t xml:space="preserve"> </w:t>
+            </w:r>
+            <w:r>
+              <w:rPr>
+                <w:rStyle w:val="VerbatimChar"/>
+                <w:sz w:val="17"/>
+              </w:rPr>
+              <w:t xml:space="preserve">confirmed</w:t>
+            </w:r>
+            <w:r>
+              <w:rPr>
+                <w:sz w:val="17"/>
+              </w:rPr>
+              <w:t xml:space="preserve"> </w:t>
+            </w:r>
+            <w:r>
+              <w:rPr>
+                <w:sz w:val="17"/>
+              </w:rPr>
+              <w:t xml:space="preserve">(SC-25 corrected 01/10/2026).</w:t>
+            </w:r>
           </w:p>
         </w:tc>
       </w:tr>
@@ -7217,7 +7682,58 @@
           <w:p>
             <w:pPr>
               <w:pStyle w:val="Compact"/>
-            </w:pPr>
+              <w:jc w:val="left"/>
+            </w:pPr>
+            <w:r>
+              <w:rPr>
+                <w:sz w:val="17"/>
+              </w:rPr>
+              <w:t xml:space="preserve">Applied:</w:t>
+            </w:r>
+            <w:r>
+              <w:rPr>
+                <w:sz w:val="17"/>
+              </w:rPr>
+              <w:t xml:space="preserve"> </w:t>
+            </w:r>
+            <w:r>
+              <w:rPr>
+                <w:rStyle w:val="VerbatimChar"/>
+                <w:sz w:val="17"/>
+              </w:rPr>
+              <w:t xml:space="preserve">organisation</w:t>
+            </w:r>
+            <w:r>
+              <w:rPr>
+                <w:sz w:val="17"/>
+              </w:rPr>
+              <w:t xml:space="preserve">,</w:t>
+            </w:r>
+            <w:r>
+              <w:rPr>
+                <w:sz w:val="17"/>
+              </w:rPr>
+              <w:t xml:space="preserve"> </w:t>
+            </w:r>
+            <w:r>
+              <w:rPr>
+                <w:rStyle w:val="VerbatimChar"/>
+                <w:sz w:val="17"/>
+              </w:rPr>
+              <w:t xml:space="preserve">organisation.service_groups</w:t>
+            </w:r>
+            <w:r>
+              <w:rPr>
+                <w:sz w:val="17"/>
+              </w:rPr>
+              <w:t xml:space="preserve"> </w:t>
+            </w:r>
+            <w:r>
+              <w:rPr>
+                <w:sz w:val="17"/>
+              </w:rPr>
+              <w:t xml:space="preserve">(SC-19, SC-20 corrected 01/10/2026).</w:t>
+            </w:r>
           </w:p>
         </w:tc>
       </w:tr>
@@ -7287,7 +7803,14 @@
           <w:p>
             <w:pPr>
               <w:pStyle w:val="Compact"/>
-            </w:pPr>
+              <w:jc w:val="left"/>
+            </w:pPr>
+            <w:r>
+              <w:rPr>
+                <w:sz w:val="17"/>
+              </w:rPr>
+              <w:t xml:space="preserve">Applied: owner SYS; M4 and M7 call F-SYS-07.</w:t>
+            </w:r>
           </w:p>
         </w:tc>
       </w:tr>
@@ -7357,7 +7880,14 @@
           <w:p>
             <w:pPr>
               <w:pStyle w:val="Compact"/>
-            </w:pPr>
+              <w:jc w:val="left"/>
+            </w:pPr>
+            <w:r>
+              <w:rPr>
+                <w:sz w:val="17"/>
+              </w:rPr>
+              <w:t xml:space="preserve">Applied: owner SYS; M4 and M7 call F-SYS-08.</w:t>
+            </w:r>
           </w:p>
         </w:tc>
       </w:tr>
@@ -7427,7 +7957,14 @@
           <w:p>
             <w:pPr>
               <w:pStyle w:val="Compact"/>
-            </w:pPr>
+              <w:jc w:val="left"/>
+            </w:pPr>
+            <w:r>
+              <w:rPr>
+                <w:sz w:val="17"/>
+              </w:rPr>
+              <w:t xml:space="preserve">Applied: owner M4 (declared in M4 §6, written by F-M4-18); it only references DOCUMENT (M5).</w:t>
+            </w:r>
           </w:p>
         </w:tc>
       </w:tr>
@@ -7497,7 +8034,52 @@
           <w:p>
             <w:pPr>
               <w:pStyle w:val="Compact"/>
-            </w:pPr>
+              <w:jc w:val="left"/>
+            </w:pPr>
+            <w:r>
+              <w:rPr>
+                <w:sz w:val="17"/>
+              </w:rPr>
+              <w:t xml:space="preserve">Applied: FIELDS names</w:t>
+            </w:r>
+            <w:r>
+              <w:rPr>
+                <w:sz w:val="17"/>
+              </w:rPr>
+              <w:t xml:space="preserve"> </w:t>
+            </w:r>
+            <w:r>
+              <w:rPr>
+                <w:rStyle w:val="VerbatimChar"/>
+                <w:sz w:val="17"/>
+              </w:rPr>
+              <w:t xml:space="preserve">scene_description</w:t>
+            </w:r>
+            <w:r>
+              <w:rPr>
+                <w:sz w:val="17"/>
+              </w:rPr>
+              <w:t xml:space="preserve">,</w:t>
+            </w:r>
+            <w:r>
+              <w:rPr>
+                <w:sz w:val="17"/>
+              </w:rPr>
+              <w:t xml:space="preserve"> </w:t>
+            </w:r>
+            <w:r>
+              <w:rPr>
+                <w:rStyle w:val="VerbatimChar"/>
+                <w:sz w:val="17"/>
+              </w:rPr>
+              <w:t xml:space="preserve">shoot_month</w:t>
+            </w:r>
+            <w:r>
+              <w:rPr>
+                <w:sz w:val="17"/>
+              </w:rPr>
+              <w:t xml:space="preserve">.</w:t>
+            </w:r>
           </w:p>
         </w:tc>
       </w:tr>
@@ -7567,7 +8149,52 @@
           <w:p>
             <w:pPr>
               <w:pStyle w:val="Compact"/>
-            </w:pPr>
+              <w:jc w:val="left"/>
+            </w:pPr>
+            <w:r>
+              <w:rPr>
+                <w:sz w:val="17"/>
+              </w:rPr>
+              <w:t xml:space="preserve">Applied: FIELDS names</w:t>
+            </w:r>
+            <w:r>
+              <w:rPr>
+                <w:sz w:val="17"/>
+              </w:rPr>
+              <w:t xml:space="preserve"> </w:t>
+            </w:r>
+            <w:r>
+              <w:rPr>
+                <w:rStyle w:val="VerbatimChar"/>
+                <w:sz w:val="17"/>
+              </w:rPr>
+              <w:t xml:space="preserve">term_en</w:t>
+            </w:r>
+            <w:r>
+              <w:rPr>
+                <w:sz w:val="17"/>
+              </w:rPr>
+              <w:t xml:space="preserve">,</w:t>
+            </w:r>
+            <w:r>
+              <w:rPr>
+                <w:sz w:val="17"/>
+              </w:rPr>
+              <w:t xml:space="preserve"> </w:t>
+            </w:r>
+            <w:r>
+              <w:rPr>
+                <w:rStyle w:val="VerbatimChar"/>
+                <w:sz w:val="17"/>
+              </w:rPr>
+              <w:t xml:space="preserve">term_vi</w:t>
+            </w:r>
+            <w:r>
+              <w:rPr>
+                <w:sz w:val="17"/>
+              </w:rPr>
+              <w:t xml:space="preserve">.</w:t>
+            </w:r>
           </w:p>
         </w:tc>
       </w:tr>
@@ -7637,7 +8264,58 @@
           <w:p>
             <w:pPr>
               <w:pStyle w:val="Compact"/>
-            </w:pPr>
+              <w:jc w:val="left"/>
+            </w:pPr>
+            <w:r>
+              <w:rPr>
+                <w:sz w:val="17"/>
+              </w:rPr>
+              <w:t xml:space="preserve">Applied:</w:t>
+            </w:r>
+            <w:r>
+              <w:rPr>
+                <w:sz w:val="17"/>
+              </w:rPr>
+              <w:t xml:space="preserve"> </w:t>
+            </w:r>
+            <w:r>
+              <w:rPr>
+                <w:rStyle w:val="VerbatimChar"/>
+                <w:sz w:val="17"/>
+              </w:rPr>
+              <w:t xml:space="preserve">admin_id</w:t>
+            </w:r>
+            <w:r>
+              <w:rPr>
+                <w:sz w:val="17"/>
+              </w:rPr>
+              <w:t xml:space="preserve">; the search filter</w:t>
+            </w:r>
+            <w:r>
+              <w:rPr>
+                <w:sz w:val="17"/>
+              </w:rPr>
+              <w:t xml:space="preserve"> </w:t>
+            </w:r>
+            <w:r>
+              <w:rPr>
+                <w:rStyle w:val="VerbatimChar"/>
+                <w:sz w:val="17"/>
+              </w:rPr>
+              <w:t xml:space="preserve">actor_id</w:t>
+            </w:r>
+            <w:r>
+              <w:rPr>
+                <w:sz w:val="17"/>
+              </w:rPr>
+              <w:t xml:space="preserve"> </w:t>
+            </w:r>
+            <w:r>
+              <w:rPr>
+                <w:sz w:val="17"/>
+              </w:rPr>
+              <w:t xml:space="preserve">of F-M10-09 filters on it.</w:t>
+            </w:r>
           </w:p>
         </w:tc>
       </w:tr>
@@ -7707,7 +8385,33 @@
           <w:p>
             <w:pPr>
               <w:pStyle w:val="Compact"/>
-            </w:pPr>
+              <w:jc w:val="left"/>
+            </w:pPr>
+            <w:r>
+              <w:rPr>
+                <w:sz w:val="17"/>
+              </w:rPr>
+              <w:t xml:space="preserve">Applied: two nullable foreign keys with a CHECK that exactly one is set and matches content_type (constraint</w:t>
+            </w:r>
+            <w:r>
+              <w:rPr>
+                <w:sz w:val="17"/>
+              </w:rPr>
+              <w:t xml:space="preserve"> </w:t>
+            </w:r>
+            <w:r>
+              <w:rPr>
+                <w:rStyle w:val="VerbatimChar"/>
+                <w:sz w:val="17"/>
+              </w:rPr>
+              <w:t xml:space="preserve">ck_moderation_item_one_target</w:t>
+            </w:r>
+            <w:r>
+              <w:rPr>
+                <w:sz w:val="17"/>
+              </w:rPr>
+              <w:t xml:space="preserve">).</w:t>
+            </w:r>
           </w:p>
         </w:tc>
       </w:tr>
@@ -7777,7 +8481,14 @@
           <w:p>
             <w:pPr>
               <w:pStyle w:val="Compact"/>
-            </w:pPr>
+              <w:jc w:val="left"/>
+            </w:pPr>
+            <w:r>
+              <w:rPr>
+                <w:sz w:val="17"/>
+              </w:rPr>
+              <w:t xml:space="preserve">Applied: owner M10; other modules never insert rows — a trigger in the same transaction writes them (M10 §4.3).</w:t>
+            </w:r>
           </w:p>
         </w:tc>
       </w:tr>
@@ -8613,7 +9324,7 @@
           <w:iCs/>
           <w:i/>
         </w:rPr>
-        <w:t xml:space="preserve">Human gate 1 (not delegable): fill the Decision column, review the implied entities, and rewrite each definition in your own words. Signed: ____________________ Date: __________</w:t>
+        <w:t xml:space="preserve">Human gate 1 (not delegable): the Decision column records the choice applied in 04 on 01/10/2026 — confirm or change it, review the implied entities, and rewrite each definition in your own words. Signed: ____________________ Date: __________</w:t>
       </w:r>
     </w:p>
     <w:bookmarkEnd w:id="24"/>

</xml_diff>